<commit_message>
fix: show company context only under latest role per company
Co-Authored-By: Claude Opus 5.5 <noreply@anthropic.com>
Claude-Session: https://claude.ai/code/session_015V6c5r5CpQppA8n9FUbDsy
</commit_message>
<xml_diff>
--- a/Ivan-Korotkov-Lead-Go-Developer.docx
+++ b/Ivan-Korotkov-Lead-Go-Developer.docx
@@ -273,6 +273,14 @@
     </w:p>
     <w:p>
       <w:pPr>
+        <w:pStyle w:val="FirstParagraph"/>
+      </w:pPr>
+      <w:r>
+        <w:t xml:space="preserve">High-load flight ticket price cache used by product teams and external partners: point lookups and wide queries with tens of filters and aggregations, near-real-time data, millisecond latency and thousands of RPS.</w:t>
+      </w:r>
+    </w:p>
+    <w:p>
+      <w:pPr>
         <w:numPr>
           <w:ilvl w:val="0"/>
           <w:numId w:val="1002"/>
@@ -280,7 +288,7 @@
         <w:pStyle w:val="Compact"/>
       </w:pPr>
       <w:r>
-        <w:t xml:space="preserve">Lead the Prices team that owns the company's flight ticket price cache, used by product teams and external partners.</w:t>
+        <w:t xml:space="preserve">Lead the Prices team that owns the cache.</w:t>
       </w:r>
     </w:p>
     <w:p>
@@ -319,14 +327,6 @@
     </w:p>
     <w:p>
       <w:pPr>
-        <w:pStyle w:val="FirstParagraph"/>
-      </w:pPr>
-      <w:r>
-        <w:t xml:space="preserve">High-load ticket cache serving point lookups and wide queries with tens of filters and aggregations, near-real-time data, millisecond latency and thousands of RPS.</w:t>
-      </w:r>
-    </w:p>
-    <w:p>
-      <w:pPr>
         <w:numPr>
           <w:ilvl w:val="0"/>
           <w:numId w:val="1003"/>
@@ -599,14 +599,6 @@
       </w:pPr>
       <w:r>
         <w:t xml:space="preserve">Software Engineer (Go, React) — IT-Swarm — May 2021 – Jul 2022</w:t>
-      </w:r>
-    </w:p>
-    <w:p>
-      <w:pPr>
-        <w:pStyle w:val="FirstParagraph"/>
-      </w:pPr>
-      <w:r>
-        <w:t xml:space="preserve">B2B marketplace connecting businesses with IT service providers.</w:t>
       </w:r>
     </w:p>
     <w:p>

</xml_diff>

<commit_message>
fix: show company context only under latest role per company (#4)
Claude-Session: https://claude.ai/code/session_015V6c5r5CpQppA8n9FUbDsy

Co-authored-by: Claude Opus 5.5 <noreply@anthropic.com>
</commit_message>
<xml_diff>
--- a/Ivan-Korotkov-Lead-Go-Developer.docx
+++ b/Ivan-Korotkov-Lead-Go-Developer.docx
@@ -273,6 +273,14 @@
     </w:p>
     <w:p>
       <w:pPr>
+        <w:pStyle w:val="FirstParagraph"/>
+      </w:pPr>
+      <w:r>
+        <w:t xml:space="preserve">High-load flight ticket price cache used by product teams and external partners: point lookups and wide queries with tens of filters and aggregations, near-real-time data, millisecond latency and thousands of RPS.</w:t>
+      </w:r>
+    </w:p>
+    <w:p>
+      <w:pPr>
         <w:numPr>
           <w:ilvl w:val="0"/>
           <w:numId w:val="1002"/>
@@ -280,7 +288,7 @@
         <w:pStyle w:val="Compact"/>
       </w:pPr>
       <w:r>
-        <w:t xml:space="preserve">Lead the Prices team that owns the company's flight ticket price cache, used by product teams and external partners.</w:t>
+        <w:t xml:space="preserve">Lead the Prices team that owns the cache.</w:t>
       </w:r>
     </w:p>
     <w:p>
@@ -319,14 +327,6 @@
     </w:p>
     <w:p>
       <w:pPr>
-        <w:pStyle w:val="FirstParagraph"/>
-      </w:pPr>
-      <w:r>
-        <w:t xml:space="preserve">High-load ticket cache serving point lookups and wide queries with tens of filters and aggregations, near-real-time data, millisecond latency and thousands of RPS.</w:t>
-      </w:r>
-    </w:p>
-    <w:p>
-      <w:pPr>
         <w:numPr>
           <w:ilvl w:val="0"/>
           <w:numId w:val="1003"/>
@@ -599,14 +599,6 @@
       </w:pPr>
       <w:r>
         <w:t xml:space="preserve">Software Engineer (Go, React) — IT-Swarm — May 2021 – Jul 2022</w:t>
-      </w:r>
-    </w:p>
-    <w:p>
-      <w:pPr>
-        <w:pStyle w:val="FirstParagraph"/>
-      </w:pPr>
-      <w:r>
-        <w:t xml:space="preserve">B2B marketplace connecting businesses with IT service providers.</w:t>
       </w:r>
     </w:p>
     <w:p>

</xml_diff>